<commit_message>
Update research notes and slide
Co-Authored-By: Claude Sonnet 5 <noreply@anthropic.com>
</commit_message>
<xml_diff>
--- a/docs/18-08/Note.docx
+++ b/docs/18-08/Note.docx
@@ -1367,6 +1367,12 @@
       <w:pPr>
         <w:spacing w:after="160"/>
         <w:jc w:val="center"/>
+        <w:rPr>
+          <w:i/>
+          <w:color w:val="5F6978"/>
+          <w:sz w:val="17"/>
+          <w:lang w:val="vi-VN"/>
+        </w:rPr>
       </w:pPr>
       <w:r>
         <w:rPr>
@@ -1374,7 +1380,477 @@
           <w:color w:val="5F6978"/>
           <w:sz w:val="17"/>
         </w:rPr>
-        <w:t>Hình minh họa Residual Quantization trong TIGER (RQ-VAE).</w:t>
+        <w:t xml:space="preserve">Hình minh họa Residual Quantization </w:t>
+      </w:r>
+      <w:proofErr w:type="spellStart"/>
+      <w:r>
+        <w:rPr>
+          <w:i/>
+          <w:color w:val="5F6978"/>
+          <w:sz w:val="17"/>
+        </w:rPr>
+        <w:t>trong</w:t>
+      </w:r>
+      <w:proofErr w:type="spellEnd"/>
+      <w:r>
+        <w:rPr>
+          <w:i/>
+          <w:color w:val="5F6978"/>
+          <w:sz w:val="17"/>
+        </w:rPr>
+        <w:t xml:space="preserve"> TIGER (RQ-VAE).</w:t>
+      </w:r>
+    </w:p>
+    <w:p>
+      <w:pPr>
+        <w:spacing w:after="0"/>
+        <w:rPr>
+          <w:iCs/>
+          <w:color w:val="auto"/>
+          <w:szCs w:val="28"/>
+          <w:lang w:val="vi-VN"/>
+        </w:rPr>
+      </w:pPr>
+      <w:r>
+        <w:rPr>
+          <w:b/>
+          <w:bCs/>
+          <w:iCs/>
+          <w:color w:val="auto"/>
+          <w:szCs w:val="28"/>
+        </w:rPr>
+        <w:t>Codebook loss:</w:t>
+      </w:r>
+      <w:r>
+        <w:rPr>
+          <w:iCs/>
+          <w:color w:val="auto"/>
+          <w:szCs w:val="28"/>
+        </w:rPr>
+        <w:t xml:space="preserve"> </w:t>
+      </w:r>
+      <w:proofErr w:type="spellStart"/>
+      <w:r>
+        <w:rPr>
+          <w:iCs/>
+          <w:color w:val="auto"/>
+          <w:szCs w:val="28"/>
+        </w:rPr>
+        <w:t>kéo</w:t>
+      </w:r>
+      <w:proofErr w:type="spellEnd"/>
+      <w:r>
+        <w:rPr>
+          <w:iCs/>
+          <w:color w:val="auto"/>
+          <w:szCs w:val="28"/>
+        </w:rPr>
+        <w:t xml:space="preserve"> codeword </w:t>
+      </w:r>
+      <w:proofErr w:type="spellStart"/>
+      <w:r>
+        <w:rPr>
+          <w:iCs/>
+          <w:color w:val="auto"/>
+          <w:szCs w:val="28"/>
+        </w:rPr>
+        <w:t>về</w:t>
+      </w:r>
+      <w:proofErr w:type="spellEnd"/>
+      <w:r>
+        <w:rPr>
+          <w:iCs/>
+          <w:color w:val="auto"/>
+          <w:szCs w:val="28"/>
+        </w:rPr>
+        <w:t xml:space="preserve"> residual </w:t>
+      </w:r>
+      <w:proofErr w:type="spellStart"/>
+      <w:r>
+        <w:rPr>
+          <w:iCs/>
+          <w:color w:val="auto"/>
+          <w:szCs w:val="28"/>
+        </w:rPr>
+        <w:t>để</w:t>
+      </w:r>
+      <w:proofErr w:type="spellEnd"/>
+      <w:r>
+        <w:rPr>
+          <w:iCs/>
+          <w:color w:val="auto"/>
+          <w:szCs w:val="28"/>
+        </w:rPr>
+        <w:t xml:space="preserve"> codebook </w:t>
+      </w:r>
+      <w:proofErr w:type="spellStart"/>
+      <w:r>
+        <w:rPr>
+          <w:iCs/>
+          <w:color w:val="auto"/>
+          <w:szCs w:val="28"/>
+        </w:rPr>
+        <w:t>đại</w:t>
+      </w:r>
+      <w:proofErr w:type="spellEnd"/>
+      <w:r>
+        <w:rPr>
+          <w:iCs/>
+          <w:color w:val="auto"/>
+          <w:szCs w:val="28"/>
+        </w:rPr>
+        <w:t xml:space="preserve"> </w:t>
+      </w:r>
+      <w:proofErr w:type="spellStart"/>
+      <w:r>
+        <w:rPr>
+          <w:iCs/>
+          <w:color w:val="auto"/>
+          <w:szCs w:val="28"/>
+        </w:rPr>
+        <w:t>diện</w:t>
+      </w:r>
+      <w:proofErr w:type="spellEnd"/>
+      <w:r>
+        <w:rPr>
+          <w:iCs/>
+          <w:color w:val="auto"/>
+          <w:szCs w:val="28"/>
+        </w:rPr>
+        <w:t xml:space="preserve"> </w:t>
+      </w:r>
+      <w:proofErr w:type="spellStart"/>
+      <w:r>
+        <w:rPr>
+          <w:iCs/>
+          <w:color w:val="auto"/>
+          <w:szCs w:val="28"/>
+        </w:rPr>
+        <w:t>tốt</w:t>
+      </w:r>
+      <w:proofErr w:type="spellEnd"/>
+      <w:r>
+        <w:rPr>
+          <w:iCs/>
+          <w:color w:val="auto"/>
+          <w:szCs w:val="28"/>
+        </w:rPr>
+        <w:t xml:space="preserve"> </w:t>
+      </w:r>
+      <w:proofErr w:type="spellStart"/>
+      <w:r>
+        <w:rPr>
+          <w:iCs/>
+          <w:color w:val="auto"/>
+          <w:szCs w:val="28"/>
+        </w:rPr>
+        <w:t>cho</w:t>
+      </w:r>
+      <w:proofErr w:type="spellEnd"/>
+      <w:r>
+        <w:rPr>
+          <w:iCs/>
+          <w:color w:val="auto"/>
+          <w:szCs w:val="28"/>
+        </w:rPr>
+        <w:t xml:space="preserve"> encoder output.</w:t>
+      </w:r>
+      <w:r>
+        <w:rPr>
+          <w:iCs/>
+          <w:color w:val="auto"/>
+          <w:szCs w:val="28"/>
+        </w:rPr>
+        <w:br/>
+      </w:r>
+      <w:r>
+        <w:rPr>
+          <w:b/>
+          <w:bCs/>
+          <w:iCs/>
+          <w:color w:val="auto"/>
+          <w:szCs w:val="28"/>
+        </w:rPr>
+        <w:t>Commitment loss:</w:t>
+      </w:r>
+      <w:r>
+        <w:rPr>
+          <w:iCs/>
+          <w:color w:val="auto"/>
+          <w:szCs w:val="28"/>
+        </w:rPr>
+        <w:t xml:space="preserve"> </w:t>
+      </w:r>
+      <w:proofErr w:type="spellStart"/>
+      <w:r>
+        <w:rPr>
+          <w:iCs/>
+          <w:color w:val="auto"/>
+          <w:szCs w:val="28"/>
+        </w:rPr>
+        <w:t>kéo</w:t>
+      </w:r>
+      <w:proofErr w:type="spellEnd"/>
+      <w:r>
+        <w:rPr>
+          <w:iCs/>
+          <w:color w:val="auto"/>
+          <w:szCs w:val="28"/>
+        </w:rPr>
+        <w:t xml:space="preserve"> encoder/residual </w:t>
+      </w:r>
+      <w:proofErr w:type="spellStart"/>
+      <w:r>
+        <w:rPr>
+          <w:iCs/>
+          <w:color w:val="auto"/>
+          <w:szCs w:val="28"/>
+        </w:rPr>
+        <w:t>về</w:t>
+      </w:r>
+      <w:proofErr w:type="spellEnd"/>
+      <w:r>
+        <w:rPr>
+          <w:iCs/>
+          <w:color w:val="auto"/>
+          <w:szCs w:val="28"/>
+        </w:rPr>
+        <w:t xml:space="preserve"> codeword </w:t>
+      </w:r>
+      <w:proofErr w:type="spellStart"/>
+      <w:r>
+        <w:rPr>
+          <w:iCs/>
+          <w:color w:val="auto"/>
+          <w:szCs w:val="28"/>
+        </w:rPr>
+        <w:t>đã</w:t>
+      </w:r>
+      <w:proofErr w:type="spellEnd"/>
+      <w:r>
+        <w:rPr>
+          <w:iCs/>
+          <w:color w:val="auto"/>
+          <w:szCs w:val="28"/>
+        </w:rPr>
+        <w:t xml:space="preserve"> </w:t>
+      </w:r>
+      <w:proofErr w:type="spellStart"/>
+      <w:r>
+        <w:rPr>
+          <w:iCs/>
+          <w:color w:val="auto"/>
+          <w:szCs w:val="28"/>
+        </w:rPr>
+        <w:t>chọn</w:t>
+      </w:r>
+      <w:proofErr w:type="spellEnd"/>
+      <w:r>
+        <w:rPr>
+          <w:iCs/>
+          <w:color w:val="auto"/>
+          <w:szCs w:val="28"/>
+        </w:rPr>
+        <w:t xml:space="preserve"> </w:t>
+      </w:r>
+      <w:proofErr w:type="spellStart"/>
+      <w:r>
+        <w:rPr>
+          <w:iCs/>
+          <w:color w:val="auto"/>
+          <w:szCs w:val="28"/>
+        </w:rPr>
+        <w:t>để</w:t>
+      </w:r>
+      <w:proofErr w:type="spellEnd"/>
+      <w:r>
+        <w:rPr>
+          <w:iCs/>
+          <w:color w:val="auto"/>
+          <w:szCs w:val="28"/>
+        </w:rPr>
+        <w:t xml:space="preserve"> representation </w:t>
+      </w:r>
+      <w:proofErr w:type="spellStart"/>
+      <w:r>
+        <w:rPr>
+          <w:iCs/>
+          <w:color w:val="auto"/>
+          <w:szCs w:val="28"/>
+        </w:rPr>
+        <w:t>không</w:t>
+      </w:r>
+      <w:proofErr w:type="spellEnd"/>
+      <w:r>
+        <w:rPr>
+          <w:iCs/>
+          <w:color w:val="auto"/>
+          <w:szCs w:val="28"/>
+        </w:rPr>
+        <w:t xml:space="preserve"> drift </w:t>
+      </w:r>
+      <w:proofErr w:type="spellStart"/>
+      <w:r>
+        <w:rPr>
+          <w:iCs/>
+          <w:color w:val="auto"/>
+          <w:szCs w:val="28"/>
+        </w:rPr>
+        <w:t>quá</w:t>
+      </w:r>
+      <w:proofErr w:type="spellEnd"/>
+      <w:r>
+        <w:rPr>
+          <w:iCs/>
+          <w:color w:val="auto"/>
+          <w:szCs w:val="28"/>
+        </w:rPr>
+        <w:t xml:space="preserve"> xa cluster.</w:t>
+      </w:r>
+      <w:r>
+        <w:rPr>
+          <w:iCs/>
+          <w:color w:val="auto"/>
+          <w:szCs w:val="28"/>
+        </w:rPr>
+        <w:br/>
+      </w:r>
+      <w:r>
+        <w:rPr>
+          <w:b/>
+          <w:bCs/>
+          <w:iCs/>
+          <w:color w:val="auto"/>
+          <w:szCs w:val="28"/>
+        </w:rPr>
+        <w:t>Reconstruction loss:</w:t>
+      </w:r>
+      <w:r>
+        <w:rPr>
+          <w:iCs/>
+          <w:color w:val="auto"/>
+          <w:szCs w:val="28"/>
+        </w:rPr>
+        <w:t xml:space="preserve"> </w:t>
+      </w:r>
+      <w:proofErr w:type="spellStart"/>
+      <w:r>
+        <w:rPr>
+          <w:iCs/>
+          <w:color w:val="auto"/>
+          <w:szCs w:val="28"/>
+        </w:rPr>
+        <w:t>đảm</w:t>
+      </w:r>
+      <w:proofErr w:type="spellEnd"/>
+      <w:r>
+        <w:rPr>
+          <w:iCs/>
+          <w:color w:val="auto"/>
+          <w:szCs w:val="28"/>
+        </w:rPr>
+        <w:t xml:space="preserve"> </w:t>
+      </w:r>
+      <w:proofErr w:type="spellStart"/>
+      <w:r>
+        <w:rPr>
+          <w:iCs/>
+          <w:color w:val="auto"/>
+          <w:szCs w:val="28"/>
+        </w:rPr>
+        <w:t>bảo</w:t>
+      </w:r>
+      <w:proofErr w:type="spellEnd"/>
+      <w:r>
+        <w:rPr>
+          <w:iCs/>
+          <w:color w:val="auto"/>
+          <w:szCs w:val="28"/>
+        </w:rPr>
+        <w:t xml:space="preserve"> representation </w:t>
+      </w:r>
+      <w:proofErr w:type="spellStart"/>
+      <w:r>
+        <w:rPr>
+          <w:iCs/>
+          <w:color w:val="auto"/>
+          <w:szCs w:val="28"/>
+        </w:rPr>
+        <w:t>sau</w:t>
+      </w:r>
+      <w:proofErr w:type="spellEnd"/>
+      <w:r>
+        <w:rPr>
+          <w:iCs/>
+          <w:color w:val="auto"/>
+          <w:szCs w:val="28"/>
+        </w:rPr>
+        <w:t xml:space="preserve"> quantization </w:t>
+      </w:r>
+      <w:proofErr w:type="spellStart"/>
+      <w:r>
+        <w:rPr>
+          <w:iCs/>
+          <w:color w:val="auto"/>
+          <w:szCs w:val="28"/>
+        </w:rPr>
+        <w:t>vẫn</w:t>
+      </w:r>
+      <w:proofErr w:type="spellEnd"/>
+      <w:r>
+        <w:rPr>
+          <w:iCs/>
+          <w:color w:val="auto"/>
+          <w:szCs w:val="28"/>
+        </w:rPr>
+        <w:t xml:space="preserve"> reconstruct </w:t>
+      </w:r>
+      <w:proofErr w:type="spellStart"/>
+      <w:r>
+        <w:rPr>
+          <w:iCs/>
+          <w:color w:val="auto"/>
+          <w:szCs w:val="28"/>
+        </w:rPr>
+        <w:t>được</w:t>
+      </w:r>
+      <w:proofErr w:type="spellEnd"/>
+      <w:r>
+        <w:rPr>
+          <w:iCs/>
+          <w:color w:val="auto"/>
+          <w:szCs w:val="28"/>
+        </w:rPr>
+        <w:t xml:space="preserve"> input.</w:t>
+      </w:r>
+    </w:p>
+    <w:p>
+      <w:pPr>
+        <w:spacing w:after="0"/>
+        <w:rPr>
+          <w:iCs/>
+          <w:color w:val="auto"/>
+          <w:szCs w:val="28"/>
+          <w:lang w:val="vi-VN"/>
+        </w:rPr>
+      </w:pPr>
+      <w:r>
+        <w:rPr>
+          <w:iCs/>
+          <w:color w:val="auto"/>
+          <w:szCs w:val="28"/>
+          <w:lang w:val="vi-VN"/>
+        </w:rPr>
+        <w:t xml:space="preserve">=&gt; </w:t>
+      </w:r>
+      <w:r>
+        <w:rPr>
+          <w:iCs/>
+          <w:color w:val="auto"/>
+          <w:szCs w:val="28"/>
+          <w:lang w:val="vi-VN"/>
+        </w:rPr>
+        <w:t>Nếu chỉ có codebook loss, centroid cứ chạy theo encoder, nhưng không có lực riêng bắt encoder output phải ở gần centroid đã chọn.</w:t>
       </w:r>
     </w:p>
     <w:p>
@@ -1438,6 +1914,7 @@
       </w:pPr>
       <w:r>
         <w:rPr>
+          <w:noProof/>
           <w:lang w:val="vi-VN"/>
         </w:rPr>
         <w:drawing>
@@ -1479,6 +1956,56 @@
     </w:p>
     <w:p>
       <w:pPr>
+        <w:shd w:val="clear" w:color="auto" w:fill="F7F9FC"/>
+        <w:spacing w:before="80" w:after="140"/>
+        <w:jc w:val="center"/>
+        <w:rPr>
+          <w:lang w:val="vi-VN"/>
+        </w:rPr>
+      </w:pPr>
+      <w:r>
+        <w:rPr>
+          <w:lang w:val="vi-VN"/>
+        </w:rPr>
+        <w:drawing>
+          <wp:inline distT="0" distB="0" distL="0" distR="0" wp14:anchorId="5977DA6F" wp14:editId="6603AE16">
+            <wp:extent cx="3581710" cy="243861"/>
+            <wp:effectExtent l="0" t="0" r="0" b="3810"/>
+            <wp:docPr id="63794224" name="Picture 1"/>
+            <wp:cNvGraphicFramePr>
+              <a:graphicFrameLocks xmlns:a="http://schemas.openxmlformats.org/drawingml/2006/main" noChangeAspect="1"/>
+            </wp:cNvGraphicFramePr>
+            <a:graphic xmlns:a="http://schemas.openxmlformats.org/drawingml/2006/main">
+              <a:graphicData uri="http://schemas.openxmlformats.org/drawingml/2006/picture">
+                <pic:pic xmlns:pic="http://schemas.openxmlformats.org/drawingml/2006/picture">
+                  <pic:nvPicPr>
+                    <pic:cNvPr id="63794224" name=""/>
+                    <pic:cNvPicPr/>
+                  </pic:nvPicPr>
+                  <pic:blipFill>
+                    <a:blip r:embed="rId19"/>
+                    <a:stretch>
+                      <a:fillRect/>
+                    </a:stretch>
+                  </pic:blipFill>
+                  <pic:spPr>
+                    <a:xfrm>
+                      <a:off x="0" y="0"/>
+                      <a:ext cx="3581710" cy="243861"/>
+                    </a:xfrm>
+                    <a:prstGeom prst="rect">
+                      <a:avLst/>
+                    </a:prstGeom>
+                  </pic:spPr>
+                </pic:pic>
+              </a:graphicData>
+            </a:graphic>
+          </wp:inline>
+        </w:drawing>
+      </w:r>
+    </w:p>
+    <w:p>
+      <w:pPr>
         <w:pStyle w:val="Heading2"/>
       </w:pPr>
       <w:r>
@@ -1607,93 +2134,6 @@
                 <pic:pic xmlns:pic="http://schemas.openxmlformats.org/drawingml/2006/picture">
                   <pic:nvPicPr>
                     <pic:cNvPr id="0" name="swing.png"/>
-                    <pic:cNvPicPr/>
-                  </pic:nvPicPr>
-                  <pic:blipFill>
-                    <a:blip r:embed="rId19"/>
-                    <a:stretch>
-                      <a:fillRect/>
-                    </a:stretch>
-                  </pic:blipFill>
-                  <pic:spPr>
-                    <a:xfrm>
-                      <a:off x="0" y="0"/>
-                      <a:ext cx="5394960" cy="519155"/>
-                    </a:xfrm>
-                    <a:prstGeom prst="rect">
-                      <a:avLst/>
-                    </a:prstGeom>
-                  </pic:spPr>
-                </pic:pic>
-              </a:graphicData>
-            </a:graphic>
-          </wp:inline>
-        </w:drawing>
-      </w:r>
-    </w:p>
-    <w:p>
-      <w:pPr>
-        <w:pStyle w:val="ListBullet"/>
-        <w:spacing w:after="44"/>
-        <w:ind w:left="259" w:hanging="173"/>
-      </w:pPr>
-      <w:r>
-        <w:t>i, j: item/ad; u, v: user.</w:t>
-      </w:r>
-    </w:p>
-    <w:p>
-      <w:pPr>
-        <w:pStyle w:val="ListBullet"/>
-        <w:spacing w:after="44"/>
-        <w:ind w:left="259" w:hanging="173"/>
-      </w:pPr>
-      <w:r>
-        <w:t>Iᵤ: tập item mà user u đã tương tác.</w:t>
-      </w:r>
-    </w:p>
-    <w:p>
-      <w:pPr>
-        <w:pStyle w:val="ListBullet"/>
-        <w:spacing w:after="44"/>
-        <w:ind w:left="259" w:hanging="173"/>
-      </w:pPr>
-      <w:r>
-        <w:t>Uᵢ: tập user đã tương tác với item i.</w:t>
-      </w:r>
-    </w:p>
-    <w:p>
-      <w:pPr>
-        <w:pStyle w:val="ListBullet"/>
-        <w:spacing w:after="44"/>
-        <w:ind w:left="259" w:hanging="173"/>
-      </w:pPr>
-      <w:r>
-        <w:t>Nếu |Iᵤ ∩ Iᵥ| lớn thì contribution của cặp user u,v giảm.</w:t>
-      </w:r>
-    </w:p>
-    <w:p>
-      <w:pPr>
-        <w:shd w:val="clear" w:color="auto" w:fill="F7F9FC"/>
-        <w:spacing w:before="80" w:after="140"/>
-        <w:jc w:val="center"/>
-      </w:pPr>
-      <w:r>
-        <w:rPr>
-          <w:noProof/>
-        </w:rPr>
-        <w:drawing>
-          <wp:inline distT="0" distB="0" distL="0" distR="0" wp14:anchorId="253F5B32" wp14:editId="0A9A4763">
-            <wp:extent cx="5394960" cy="519155"/>
-            <wp:effectExtent l="0" t="0" r="0" b="0"/>
-            <wp:docPr id="11" name="Picture 11"/>
-            <wp:cNvGraphicFramePr>
-              <a:graphicFrameLocks xmlns:a="http://schemas.openxmlformats.org/drawingml/2006/main" noChangeAspect="1"/>
-            </wp:cNvGraphicFramePr>
-            <a:graphic xmlns:a="http://schemas.openxmlformats.org/drawingml/2006/main">
-              <a:graphicData uri="http://schemas.openxmlformats.org/drawingml/2006/picture">
-                <pic:pic xmlns:pic="http://schemas.openxmlformats.org/drawingml/2006/picture">
-                  <pic:nvPicPr>
-                    <pic:cNvPr id="0" name="swingw.png"/>
                     <pic:cNvPicPr/>
                   </pic:nvPicPr>
                   <pic:blipFill>
@@ -1725,6 +2165,93 @@
         <w:ind w:left="259" w:hanging="173"/>
       </w:pPr>
       <w:r>
+        <w:t>i, j: item/ad; u, v: user.</w:t>
+      </w:r>
+    </w:p>
+    <w:p>
+      <w:pPr>
+        <w:pStyle w:val="ListBullet"/>
+        <w:spacing w:after="44"/>
+        <w:ind w:left="259" w:hanging="173"/>
+      </w:pPr>
+      <w:r>
+        <w:t>Iᵤ: tập item mà user u đã tương tác.</w:t>
+      </w:r>
+    </w:p>
+    <w:p>
+      <w:pPr>
+        <w:pStyle w:val="ListBullet"/>
+        <w:spacing w:after="44"/>
+        <w:ind w:left="259" w:hanging="173"/>
+      </w:pPr>
+      <w:r>
+        <w:t>Uᵢ: tập user đã tương tác với item i.</w:t>
+      </w:r>
+    </w:p>
+    <w:p>
+      <w:pPr>
+        <w:pStyle w:val="ListBullet"/>
+        <w:spacing w:after="44"/>
+        <w:ind w:left="259" w:hanging="173"/>
+      </w:pPr>
+      <w:r>
+        <w:t>Nếu |Iᵤ ∩ Iᵥ| lớn thì contribution của cặp user u,v giảm.</w:t>
+      </w:r>
+    </w:p>
+    <w:p>
+      <w:pPr>
+        <w:shd w:val="clear" w:color="auto" w:fill="F7F9FC"/>
+        <w:spacing w:before="80" w:after="140"/>
+        <w:jc w:val="center"/>
+      </w:pPr>
+      <w:r>
+        <w:rPr>
+          <w:noProof/>
+        </w:rPr>
+        <w:drawing>
+          <wp:inline distT="0" distB="0" distL="0" distR="0" wp14:anchorId="253F5B32" wp14:editId="0A9A4763">
+            <wp:extent cx="5394960" cy="519155"/>
+            <wp:effectExtent l="0" t="0" r="0" b="0"/>
+            <wp:docPr id="11" name="Picture 11"/>
+            <wp:cNvGraphicFramePr>
+              <a:graphicFrameLocks xmlns:a="http://schemas.openxmlformats.org/drawingml/2006/main" noChangeAspect="1"/>
+            </wp:cNvGraphicFramePr>
+            <a:graphic xmlns:a="http://schemas.openxmlformats.org/drawingml/2006/main">
+              <a:graphicData uri="http://schemas.openxmlformats.org/drawingml/2006/picture">
+                <pic:pic xmlns:pic="http://schemas.openxmlformats.org/drawingml/2006/picture">
+                  <pic:nvPicPr>
+                    <pic:cNvPr id="0" name="swingw.png"/>
+                    <pic:cNvPicPr/>
+                  </pic:nvPicPr>
+                  <pic:blipFill>
+                    <a:blip r:embed="rId21"/>
+                    <a:stretch>
+                      <a:fillRect/>
+                    </a:stretch>
+                  </pic:blipFill>
+                  <pic:spPr>
+                    <a:xfrm>
+                      <a:off x="0" y="0"/>
+                      <a:ext cx="5394960" cy="519155"/>
+                    </a:xfrm>
+                    <a:prstGeom prst="rect">
+                      <a:avLst/>
+                    </a:prstGeom>
+                  </pic:spPr>
+                </pic:pic>
+              </a:graphicData>
+            </a:graphic>
+          </wp:inline>
+        </w:drawing>
+      </w:r>
+    </w:p>
+    <w:p>
+      <w:pPr>
+        <w:pStyle w:val="ListBullet"/>
+        <w:spacing w:after="44"/>
+        <w:ind w:left="259" w:hanging="173"/>
+      </w:pPr>
+      <w:r>
         <w:t>User quá active (tương tác rất nhiều item) có weight nhỏ hơn; user ít active có weight lớn hơn.</w:t>
       </w:r>
     </w:p>
@@ -1772,7 +2299,7 @@
                     <pic:cNvPicPr/>
                   </pic:nvPicPr>
                   <pic:blipFill>
-                    <a:blip r:embed="rId21"/>
+                    <a:blip r:embed="rId22"/>
                     <a:stretch>
                       <a:fillRect/>
                     </a:stretch>
@@ -1937,7 +2464,7 @@
                     <pic:cNvPicPr/>
                   </pic:nvPicPr>
                   <pic:blipFill>
-                    <a:blip r:embed="rId22"/>
+                    <a:blip r:embed="rId23"/>
                     <a:stretch>
                       <a:fillRect/>
                     </a:stretch>
@@ -2035,7 +2562,7 @@
                     <pic:cNvPicPr/>
                   </pic:nvPicPr>
                   <pic:blipFill>
-                    <a:blip r:embed="rId23"/>
+                    <a:blip r:embed="rId24"/>
                     <a:stretch>
                       <a:fillRect/>
                     </a:stretch>
@@ -2087,7 +2614,7 @@
         <w:ind w:left="259" w:hanging="173"/>
       </w:pPr>
       <w:r>
-        <w:t>Fuse được ghi dạng m̃ₜ = Fuse(mₜ, sₜ₋₁). Công thức chi tiết phía dưới ảnh bị khó đọc hoàn toàn nên không chép lại để tránh sai.</w:t>
+        <w:t>Fuse được ghi dạng m̃ₜ = Fuse(mₜ, sₜ₋₁).</w:t>
       </w:r>
     </w:p>
     <w:p>
@@ -2136,7 +2663,31 @@
         <w:ind w:left="259" w:hanging="173"/>
       </w:pPr>
       <w:r>
-        <w:t>Ghi chú tay: s₁ có thể vẫn đi full vanilla AR; các SID token sau dùng LazyAR. [Cần đối chiếu paper nếu dùng làm công thức chính thức.]</w:t>
+        <w:t xml:space="preserve">Ghi chú tay: s₁ có thể vẫn đi full vanilla AR; các SID token </w:t>
+      </w:r>
+      <w:proofErr w:type="spellStart"/>
+      <w:r>
+        <w:t>sau</w:t>
+      </w:r>
+      <w:proofErr w:type="spellEnd"/>
+      <w:r>
+        <w:t xml:space="preserve"> </w:t>
+      </w:r>
+      <w:proofErr w:type="spellStart"/>
+      <w:r>
+        <w:t>dùng</w:t>
+      </w:r>
+      <w:proofErr w:type="spellEnd"/>
+      <w:r>
+        <w:t xml:space="preserve"> </w:t>
+      </w:r>
+      <w:proofErr w:type="spellStart"/>
+      <w:r>
+        <w:t>LazyAR</w:t>
+      </w:r>
+      <w:proofErr w:type="spellEnd"/>
+      <w:r>
+        <w:t>.</w:t>
       </w:r>
     </w:p>
     <w:p>
@@ -2248,73 +2799,6 @@
                 <pic:pic xmlns:pic="http://schemas.openxmlformats.org/drawingml/2006/picture">
                   <pic:nvPicPr>
                     <pic:cNvPr id="0" name="eiset.png"/>
-                    <pic:cNvPicPr/>
-                  </pic:nvPicPr>
-                  <pic:blipFill>
-                    <a:blip r:embed="rId24"/>
-                    <a:stretch>
-                      <a:fillRect/>
-                    </a:stretch>
-                  </pic:blipFill>
-                  <pic:spPr>
-                    <a:xfrm>
-                      <a:off x="0" y="0"/>
-                      <a:ext cx="5394960" cy="519155"/>
-                    </a:xfrm>
-                    <a:prstGeom prst="rect">
-                      <a:avLst/>
-                    </a:prstGeom>
-                  </pic:spPr>
-                </pic:pic>
-              </a:graphicData>
-            </a:graphic>
-          </wp:inline>
-        </w:drawing>
-      </w:r>
-    </w:p>
-    <w:p>
-      <w:pPr>
-        <w:pStyle w:val="ListBullet"/>
-        <w:spacing w:after="44"/>
-        <w:ind w:left="259" w:hanging="173"/>
-      </w:pPr>
-      <w:r>
-        <w:t>Ví dụ E_A={B,C,D}; E_B={C,D}. Tức mỗi candidate i được so với các candidate có reward thấp hơn.</w:t>
-      </w:r>
-    </w:p>
-    <w:p>
-      <w:pPr>
-        <w:pStyle w:val="ListBullet"/>
-        <w:spacing w:after="44"/>
-        <w:ind w:left="259" w:hanging="173"/>
-      </w:pPr>
-      <w:r>
-        <w:t>Xác suất của một ad/SID đầy đủ là tích xác suất token có điều kiện:</w:t>
-      </w:r>
-    </w:p>
-    <w:p>
-      <w:pPr>
-        <w:shd w:val="clear" w:color="auto" w:fill="F7F9FC"/>
-        <w:spacing w:before="80" w:after="140"/>
-        <w:jc w:val="center"/>
-      </w:pPr>
-      <w:r>
-        <w:rPr>
-          <w:noProof/>
-        </w:rPr>
-        <w:drawing>
-          <wp:inline distT="0" distB="0" distL="0" distR="0" wp14:anchorId="4169916F" wp14:editId="09FD14DC">
-            <wp:extent cx="5394960" cy="519155"/>
-            <wp:effectExtent l="0" t="0" r="0" b="0"/>
-            <wp:docPr id="14" name="Picture 14"/>
-            <wp:cNvGraphicFramePr>
-              <a:graphicFrameLocks xmlns:a="http://schemas.openxmlformats.org/drawingml/2006/main" noChangeAspect="1"/>
-            </wp:cNvGraphicFramePr>
-            <a:graphic xmlns:a="http://schemas.openxmlformats.org/drawingml/2006/main">
-              <a:graphicData uri="http://schemas.openxmlformats.org/drawingml/2006/picture">
-                <pic:pic xmlns:pic="http://schemas.openxmlformats.org/drawingml/2006/picture">
-                  <pic:nvPicPr>
-                    <pic:cNvPr id="0" name="prob.png"/>
                     <pic:cNvPicPr/>
                   </pic:nvPicPr>
                   <pic:blipFill>
@@ -2346,7 +2830,7 @@
         <w:ind w:left="259" w:hanging="173"/>
       </w:pPr>
       <w:r>
-        <w:t>Ghi chú ví dụ: nếu q_B−q_A và q_C−q_A âm lớn thì exp(q_j−q_i) rất nhỏ ⇒ loss nhỏ; mục tiêu là model xếp ad có reward cao lên trên.</w:t>
+        <w:t>Ví dụ E_A={B,C,D}; E_B={C,D}. Tức mỗi candidate i được so với các candidate có reward thấp hơn.</w:t>
       </w:r>
     </w:p>
     <w:p>
@@ -2356,154 +2840,7 @@
         <w:ind w:left="259" w:hanging="173"/>
       </w:pPr>
       <w:r>
-        <w:t>Công thức loss RSPO chi tiết trong ảnh viết tay không đủ rõ để chép nguyên xi; phần định nghĩa Eᵢ và trực giác ranking ở trên là phần đọc được chắc chắn.</w:t>
-      </w:r>
-    </w:p>
-    <w:p>
-      <w:pPr>
-        <w:pStyle w:val="Heading2"/>
-      </w:pPr>
-      <w:r>
-        <w:t>6.9. Serving / Dynamic Beam (ghi chú từ vở)</w:t>
-      </w:r>
-    </w:p>
-    <w:p>
-      <w:pPr>
-        <w:pStyle w:val="ListBullet"/>
-        <w:spacing w:after="44"/>
-        <w:ind w:left="259" w:hanging="173"/>
-      </w:pPr>
-      <w:r>
-        <w:t>Có ghi empirical test giảm beam: cấu hình fixed [512,512,512] và progressive beam [128,256,512] / các biến thể; ghi chú QPS tăng khoảng 27%–45% tùy cấu hình.</w:t>
-      </w:r>
-    </w:p>
-    <w:p>
-      <w:pPr>
-        <w:pStyle w:val="ListBullet"/>
-        <w:spacing w:after="44"/>
-        <w:ind w:left="259" w:hanging="173"/>
-      </w:pPr>
-      <w:r>
-        <w:t>Traffic-aware: khi traffic thấp có thể tăng tổng beam / tận dụng compute slack; khi peak giảm beam để giữ serving budget.</w:t>
-      </w:r>
-    </w:p>
-    <w:p>
-      <w:pPr>
-        <w:pStyle w:val="ListBullet"/>
-        <w:spacing w:after="44"/>
-        <w:ind w:left="259" w:hanging="173"/>
-      </w:pPr>
-      <w:r>
-        <w:t>Có ghi một “unified learning” weight A ∈ [0,1] để cân bằng VSL và RSPO; công thức trên ảnh khó đọc hoàn toàn nên cần đối chiếu paper trước khi dùng.</w:t>
-      </w:r>
-    </w:p>
-    <w:p>
-      <w:r>
-        <w:br w:type="page"/>
-      </w:r>
-    </w:p>
-    <w:p>
-      <w:pPr>
-        <w:pStyle w:val="Heading1"/>
-        <w:pBdr>
-          <w:bottom w:val="single" w:sz="7" w:space="2" w:color="D6E1EF"/>
-        </w:pBdr>
-      </w:pPr>
-      <w:r>
-        <w:lastRenderedPageBreak/>
-        <w:t>7. TSGR / Query-conditioned SID / VRM</w:t>
-      </w:r>
-    </w:p>
-    <w:p>
-      <w:pPr>
-        <w:pStyle w:val="Heading2"/>
-      </w:pPr>
-      <w:r>
-        <w:t>7.1. Query-conditioned level-3 SID (QP-SID)</w:t>
-      </w:r>
-    </w:p>
-    <w:p>
-      <w:pPr>
-        <w:pStyle w:val="ListBullet"/>
-        <w:spacing w:after="44"/>
-        <w:ind w:left="259" w:hanging="173"/>
-      </w:pPr>
-      <w:r>
-        <w:t>Ghi chú: SID level 3 được xem như rank/position của item theo query-specific ordering π_query; nếu không match thì fallback về π₀.</w:t>
-      </w:r>
-    </w:p>
-    <w:p>
-      <w:pPr>
-        <w:pStyle w:val="ListBullet"/>
-        <w:spacing w:after="44"/>
-        <w:ind w:left="259" w:hanging="173"/>
-      </w:pPr>
-      <w:r>
-        <w:t>Có ký hiệu t* để chọn ordering phù hợp nhất với query; biểu thức argmax trong ảnh không đủ rõ nên không chép chính xác.</w:t>
-      </w:r>
-    </w:p>
-    <w:p>
-      <w:pPr>
-        <w:pStyle w:val="ListBullet"/>
-        <w:spacing w:after="44"/>
-        <w:ind w:left="259" w:hanging="173"/>
-      </w:pPr>
-      <w:r>
-        <w:t>Ví dụ “iphone magsafe case”: session có pay→B, click→D, pv→A, unpv→C; semantic prefix (c₁,c₂)=(10,5).</w:t>
-      </w:r>
-    </w:p>
-    <w:p>
-      <w:pPr>
-        <w:pStyle w:val="ListBullet"/>
-        <w:spacing w:after="44"/>
-        <w:ind w:left="259" w:hanging="173"/>
-      </w:pPr>
-      <w:r>
-        <w:t>Query match “magsafe”, ordering ghi trong vở: B→0, D→1, A→4.</w:t>
-      </w:r>
-    </w:p>
-    <w:p>
-      <w:pPr>
-        <w:shd w:val="clear" w:color="auto" w:fill="EEF4FB"/>
-        <w:spacing w:before="80" w:after="140"/>
-        <w:jc w:val="center"/>
-      </w:pPr>
-      <w:r>
-        <w:rPr>
-          <w:b/>
-          <w:i/>
-          <w:color w:val="184376"/>
-          <w:sz w:val="22"/>
-        </w:rPr>
-        <w:t>B = (10,5,0),   D = (10,5,1),   A = (10,5,4)</w:t>
-      </w:r>
-    </w:p>
-    <w:p>
-      <w:pPr>
-        <w:pStyle w:val="ListBullet"/>
-        <w:spacing w:after="44"/>
-        <w:ind w:left="259" w:hanging="173"/>
-      </w:pPr>
-      <w:r>
-        <w:t>Loss weighting được ghi: pay &gt; click &gt; pv; một ví dụ ở mép trang tương ứng 3 : 2 : 1.</w:t>
-      </w:r>
-    </w:p>
-    <w:p>
-      <w:pPr>
-        <w:pStyle w:val="Heading2"/>
-      </w:pPr>
-      <w:r>
-        <w:t>7.2. VRM</w:t>
-      </w:r>
-    </w:p>
-    <w:p>
-      <w:pPr>
-        <w:pStyle w:val="ListBullet"/>
-        <w:spacing w:after="44"/>
-        <w:ind w:left="259" w:hanging="173"/>
-      </w:pPr>
-      <w:r>
-        <w:t>Luồng ghi trong vở: item representation + user/context hidden states → mean pooling + cross-attention → predictor heads.</w:t>
+        <w:t>Xác suất của một ad/SID đầy đủ là tích xác suất token có điều kiện:</w:t>
       </w:r>
     </w:p>
     <w:p>
@@ -2517,10 +2854,10 @@
           <w:noProof/>
         </w:rPr>
         <w:drawing>
-          <wp:inline distT="0" distB="0" distL="0" distR="0" wp14:anchorId="4D1604FA" wp14:editId="60C9C87B">
+          <wp:inline distT="0" distB="0" distL="0" distR="0" wp14:anchorId="4169916F" wp14:editId="09FD14DC">
             <wp:extent cx="5394960" cy="519155"/>
             <wp:effectExtent l="0" t="0" r="0" b="0"/>
-            <wp:docPr id="15" name="Picture 15"/>
+            <wp:docPr id="14" name="Picture 14"/>
             <wp:cNvGraphicFramePr>
               <a:graphicFrameLocks xmlns:a="http://schemas.openxmlformats.org/drawingml/2006/main" noChangeAspect="1"/>
             </wp:cNvGraphicFramePr>
@@ -2528,7 +2865,7 @@
               <a:graphicData uri="http://schemas.openxmlformats.org/drawingml/2006/picture">
                 <pic:pic xmlns:pic="http://schemas.openxmlformats.org/drawingml/2006/picture">
                   <pic:nvPicPr>
-                    <pic:cNvPr id="0" name="qkv.png"/>
+                    <pic:cNvPr id="0" name="prob.png"/>
                     <pic:cNvPicPr/>
                   </pic:nvPicPr>
                   <pic:blipFill>
@@ -2560,7 +2897,7 @@
         <w:ind w:left="259" w:hanging="173"/>
       </w:pPr>
       <w:r>
-        <w:t>u (pooled user representation) được ghi là global context; cross-attention dùng full Hᵤ để lấy candidate-specific interaction.</w:t>
+        <w:t>Ghi chú ví dụ: nếu q_B−q_A và q_C−q_A âm lớn thì exp(q_j−q_i) rất nhỏ ⇒ loss nhỏ; mục tiêu là model xếp ad có reward cao lên trên.</w:t>
       </w:r>
     </w:p>
     <w:p>
@@ -2570,11 +2907,343 @@
         <w:ind w:left="259" w:hanging="173"/>
       </w:pPr>
       <w:r>
-        <w:t>Các head/output được ghi liên quan PV / CTR / CVR; phần ký hiệu từng y-hat ở ảnh hơi mờ nhưng cấu trúc ba nhánh là rõ</w:t>
-      </w:r>
+        <w:t>Công thức loss RSPO chi tiết trong ảnh viết tay không đủ rõ để chép nguyên xi; phần định nghĩa Eᵢ và trực giác ranking ở trên là phần đọc được chắc chắn.</w:t>
+      </w:r>
+    </w:p>
+    <w:p>
+      <w:pPr>
+        <w:pStyle w:val="Heading2"/>
+        <w:rPr>
+          <w:lang w:val="vi-VN"/>
+        </w:rPr>
+      </w:pPr>
+      <w:r>
+        <w:t>6.9. Serving / Dynamic Beam</w:t>
+      </w:r>
+    </w:p>
+    <w:p>
+      <w:pPr>
+        <w:pStyle w:val="ListBullet"/>
+        <w:spacing w:after="44"/>
+        <w:ind w:left="259" w:hanging="173"/>
+        <w:rPr>
+          <w:lang w:val="vi-VN"/>
+        </w:rPr>
+      </w:pPr>
+      <w:r>
+        <w:rPr>
+          <w:lang w:val="vi-VN"/>
+        </w:rPr>
+        <w:t>Có ghi empirical test giảm beam: cấu hình fixed [512,512,512] và progressive beam [128,256,512] / các biến thể; ghi chú QPS tăng khoảng 27%–45% tùy cấu hình.</w:t>
+      </w:r>
+    </w:p>
+    <w:p>
+      <w:pPr>
+        <w:pStyle w:val="ListBullet"/>
+        <w:spacing w:after="44"/>
+        <w:ind w:left="259" w:hanging="173"/>
+      </w:pPr>
+      <w:r>
+        <w:t xml:space="preserve">Traffic-aware: </w:t>
+      </w:r>
+      <w:proofErr w:type="spellStart"/>
+      <w:r>
+        <w:t>khi</w:t>
+      </w:r>
+      <w:proofErr w:type="spellEnd"/>
+      <w:r>
+        <w:t xml:space="preserve"> traffic </w:t>
+      </w:r>
+      <w:proofErr w:type="spellStart"/>
+      <w:r>
+        <w:t>thấp</w:t>
+      </w:r>
+      <w:proofErr w:type="spellEnd"/>
+      <w:r>
+        <w:t xml:space="preserve"> </w:t>
+      </w:r>
+      <w:proofErr w:type="spellStart"/>
+      <w:r>
+        <w:t>có</w:t>
+      </w:r>
+      <w:proofErr w:type="spellEnd"/>
+      <w:r>
+        <w:t xml:space="preserve"> thể tăng tổng beam / tận dụng compute slack; khi peak giảm beam để giữ serving budget.</w:t>
+      </w:r>
+    </w:p>
+    <w:p>
+      <w:pPr>
+        <w:pStyle w:val="ListBullet"/>
+        <w:spacing w:after="44"/>
+        <w:ind w:left="259" w:hanging="173"/>
+      </w:pPr>
+      <w:r>
+        <w:t>Có ghi một “unified learning” weight A ∈ [0,1] để cân bằng VSL và RSPO; công thức trên ảnh khó đọc hoàn toàn nên cần đối chiếu paper trước khi dùng.</w:t>
+      </w:r>
+    </w:p>
+    <w:p>
+      <w:r>
+        <w:br w:type="page"/>
+      </w:r>
+    </w:p>
+    <w:p>
+      <w:pPr>
+        <w:pStyle w:val="Heading1"/>
+        <w:pBdr>
+          <w:bottom w:val="single" w:sz="7" w:space="2" w:color="D6E1EF"/>
+        </w:pBdr>
+      </w:pPr>
+      <w:r>
+        <w:lastRenderedPageBreak/>
+        <w:t>7. TSGR / Query-conditioned SID / VRM</w:t>
+      </w:r>
+    </w:p>
+    <w:p>
+      <w:pPr>
+        <w:pStyle w:val="Heading2"/>
+      </w:pPr>
+      <w:r>
+        <w:t>7.1. Query-conditioned level-3 SID (QP-SID)</w:t>
+      </w:r>
+    </w:p>
+    <w:p>
+      <w:pPr>
+        <w:pStyle w:val="ListBullet"/>
+        <w:spacing w:after="44"/>
+        <w:ind w:left="259" w:hanging="173"/>
+      </w:pPr>
+      <w:r>
+        <w:t>Ghi chú: SID level 3 được xem như rank/position của item theo query-specific ordering π_query; nếu không match thì fallback về π₀.</w:t>
+      </w:r>
+    </w:p>
+    <w:p>
+      <w:pPr>
+        <w:pStyle w:val="ListBullet"/>
+        <w:spacing w:after="44"/>
+        <w:ind w:left="259" w:hanging="173"/>
+      </w:pPr>
+      <w:r>
+        <w:t>Có ký hiệu t* để chọn ordering phù hợp nhất với query; biểu thức argmax trong ảnh không đủ rõ nên không chép chính xác.</w:t>
+      </w:r>
+    </w:p>
+    <w:p>
+      <w:pPr>
+        <w:pStyle w:val="ListBullet"/>
+        <w:spacing w:after="44"/>
+        <w:ind w:left="259" w:hanging="173"/>
+      </w:pPr>
+      <w:r>
+        <w:t>Ví dụ “iphone magsafe case”: session có pay→B, click→D, pv→A, unpv→C; semantic prefix (c₁,c₂)=(10,5).</w:t>
+      </w:r>
+    </w:p>
+    <w:p>
+      <w:pPr>
+        <w:pStyle w:val="ListBullet"/>
+        <w:spacing w:after="44"/>
+        <w:ind w:left="259" w:hanging="173"/>
+      </w:pPr>
+      <w:r>
+        <w:t>Query match “magsafe”, ordering ghi trong vở: B→0, D→1, A→4.</w:t>
+      </w:r>
+    </w:p>
+    <w:p>
+      <w:pPr>
+        <w:shd w:val="clear" w:color="auto" w:fill="EEF4FB"/>
+        <w:spacing w:before="80" w:after="140"/>
+        <w:jc w:val="center"/>
+      </w:pPr>
+      <w:r>
+        <w:rPr>
+          <w:b/>
+          <w:i/>
+          <w:color w:val="184376"/>
+          <w:sz w:val="22"/>
+        </w:rPr>
+        <w:t>B = (10,5,0),   D = (10,5,1),   A = (10,5,4)</w:t>
+      </w:r>
+    </w:p>
+    <w:p>
+      <w:pPr>
+        <w:pStyle w:val="ListBullet"/>
+        <w:spacing w:after="44"/>
+        <w:ind w:left="259" w:hanging="173"/>
+      </w:pPr>
+      <w:r>
+        <w:t>Loss weighting được ghi: pay &gt; click &gt; pv; một ví dụ ở mép trang tương ứng 3 : 2 : 1.</w:t>
+      </w:r>
+    </w:p>
+    <w:p>
+      <w:pPr>
+        <w:pStyle w:val="Heading2"/>
+      </w:pPr>
+      <w:r>
+        <w:t>7.2. VRM</w:t>
+      </w:r>
+    </w:p>
+    <w:p>
+      <w:pPr>
+        <w:pStyle w:val="ListBullet"/>
+        <w:spacing w:after="44"/>
+        <w:ind w:left="259" w:hanging="173"/>
+      </w:pPr>
+      <w:r>
+        <w:t>Luồng ghi trong vở: item representation + user/context hidden states → mean pooling + cross-attention → predictor heads.</w:t>
+      </w:r>
+    </w:p>
+    <w:p>
+      <w:pPr>
+        <w:shd w:val="clear" w:color="auto" w:fill="F7F9FC"/>
+        <w:spacing w:before="80" w:after="140"/>
+        <w:jc w:val="center"/>
+      </w:pPr>
+      <w:r>
+        <w:rPr>
+          <w:noProof/>
+        </w:rPr>
+        <w:drawing>
+          <wp:inline distT="0" distB="0" distL="0" distR="0" wp14:anchorId="4D1604FA" wp14:editId="60C9C87B">
+            <wp:extent cx="5394960" cy="519155"/>
+            <wp:effectExtent l="0" t="0" r="0" b="0"/>
+            <wp:docPr id="15" name="Picture 15"/>
+            <wp:cNvGraphicFramePr>
+              <a:graphicFrameLocks xmlns:a="http://schemas.openxmlformats.org/drawingml/2006/main" noChangeAspect="1"/>
+            </wp:cNvGraphicFramePr>
+            <a:graphic xmlns:a="http://schemas.openxmlformats.org/drawingml/2006/main">
+              <a:graphicData uri="http://schemas.openxmlformats.org/drawingml/2006/picture">
+                <pic:pic xmlns:pic="http://schemas.openxmlformats.org/drawingml/2006/picture">
+                  <pic:nvPicPr>
+                    <pic:cNvPr id="0" name="qkv.png"/>
+                    <pic:cNvPicPr/>
+                  </pic:nvPicPr>
+                  <pic:blipFill>
+                    <a:blip r:embed="rId27"/>
+                    <a:stretch>
+                      <a:fillRect/>
+                    </a:stretch>
+                  </pic:blipFill>
+                  <pic:spPr>
+                    <a:xfrm>
+                      <a:off x="0" y="0"/>
+                      <a:ext cx="5394960" cy="519155"/>
+                    </a:xfrm>
+                    <a:prstGeom prst="rect">
+                      <a:avLst/>
+                    </a:prstGeom>
+                  </pic:spPr>
+                </pic:pic>
+              </a:graphicData>
+            </a:graphic>
+          </wp:inline>
+        </w:drawing>
+      </w:r>
+    </w:p>
+    <w:p>
+      <w:pPr>
+        <w:pStyle w:val="ListBullet"/>
+        <w:spacing w:after="44"/>
+        <w:ind w:left="259" w:hanging="173"/>
+      </w:pPr>
+      <w:r>
+        <w:t>u (pooled user representation) được ghi là global context; cross-attention dùng full Hᵤ để lấy candidate-specific interaction.</w:t>
+      </w:r>
+    </w:p>
+    <w:p>
+      <w:pPr>
+        <w:pStyle w:val="ListBullet"/>
+        <w:spacing w:after="44"/>
+        <w:ind w:left="259" w:hanging="173"/>
+      </w:pPr>
+      <w:r>
+        <w:t xml:space="preserve">Các head/output được ghi liên quan PV / CTR / CVR; phần ký hiệu </w:t>
+      </w:r>
+      <w:proofErr w:type="spellStart"/>
+      <w:r>
+        <w:t>từng</w:t>
+      </w:r>
+      <w:proofErr w:type="spellEnd"/>
+      <w:r>
+        <w:t xml:space="preserve"> y-hat ở </w:t>
+      </w:r>
+      <w:proofErr w:type="spellStart"/>
+      <w:r>
+        <w:t>ảnh</w:t>
+      </w:r>
+      <w:proofErr w:type="spellEnd"/>
+      <w:r>
+        <w:t xml:space="preserve"> </w:t>
+      </w:r>
+      <w:proofErr w:type="spellStart"/>
+      <w:r>
+        <w:t>hơi</w:t>
+      </w:r>
+      <w:proofErr w:type="spellEnd"/>
+      <w:r>
+        <w:t xml:space="preserve"> </w:t>
+      </w:r>
+      <w:proofErr w:type="spellStart"/>
+      <w:r>
+        <w:t>mờ</w:t>
+      </w:r>
+      <w:proofErr w:type="spellEnd"/>
+      <w:r>
+        <w:t xml:space="preserve"> </w:t>
+      </w:r>
+      <w:proofErr w:type="spellStart"/>
+      <w:r>
+        <w:t>nhưng</w:t>
+      </w:r>
+      <w:proofErr w:type="spellEnd"/>
+      <w:r>
+        <w:t xml:space="preserve"> </w:t>
+      </w:r>
+      <w:proofErr w:type="spellStart"/>
+      <w:r>
+        <w:t>cấu</w:t>
+      </w:r>
+      <w:proofErr w:type="spellEnd"/>
+      <w:r>
+        <w:t xml:space="preserve"> </w:t>
+      </w:r>
+      <w:proofErr w:type="spellStart"/>
+      <w:r>
+        <w:t>trúc</w:t>
+      </w:r>
+      <w:proofErr w:type="spellEnd"/>
+      <w:r>
+        <w:t xml:space="preserve"> </w:t>
+      </w:r>
+      <w:proofErr w:type="spellStart"/>
+      <w:r>
+        <w:t>ba</w:t>
+      </w:r>
+      <w:proofErr w:type="spellEnd"/>
+      <w:r>
+        <w:t xml:space="preserve"> </w:t>
+      </w:r>
+      <w:proofErr w:type="spellStart"/>
+      <w:r>
+        <w:t>nhánh</w:t>
+      </w:r>
+      <w:proofErr w:type="spellEnd"/>
+      <w:r>
+        <w:t xml:space="preserve"> </w:t>
+      </w:r>
+      <w:proofErr w:type="spellStart"/>
+      <w:r>
+        <w:t>là</w:t>
+      </w:r>
+      <w:proofErr w:type="spellEnd"/>
+      <w:r>
+        <w:t xml:space="preserve"> </w:t>
+      </w:r>
+      <w:proofErr w:type="spellStart"/>
+      <w:r>
+        <w:t>rõ</w:t>
+      </w:r>
+      <w:proofErr w:type="spellEnd"/>
     </w:p>
     <w:sectPr>
-      <w:footerReference w:type="default" r:id="rId27"/>
+      <w:footerReference w:type="default" r:id="rId28"/>
       <w:pgSz w:w="12240" w:h="15840"/>
       <w:pgMar w:top="893" w:right="1037" w:bottom="893" w:left="1037" w:header="720" w:footer="720" w:gutter="0"/>
       <w:cols w:space="720"/>
@@ -3465,7 +4134,6 @@
   <w:style w:type="character" w:default="1" w:styleId="DefaultParagraphFont">
     <w:name w:val="Default Paragraph Font"/>
     <w:uiPriority w:val="1"/>
-    <w:semiHidden/>
     <w:unhideWhenUsed/>
   </w:style>
   <w:style w:type="table" w:default="1" w:styleId="TableNormal">

</xml_diff>